<commit_message>
feat: update CV details and improve formatting for clarity and consistency
</commit_message>
<xml_diff>
--- a/CV ATS EN NEW.docx
+++ b/CV ATS EN NEW.docx
@@ -1113,6 +1113,13 @@
                 <w:rFonts w:ascii="Times New Roman" w:hAnsi="Times New Roman" w:cs="Times New Roman"/>
                 <w:bCs/>
               </w:rPr>
+              <w:t xml:space="preserve">On-Site, </w:t>
+            </w:r>
+            <w:r>
+              <w:rPr>
+                <w:rFonts w:ascii="Times New Roman" w:hAnsi="Times New Roman" w:cs="Times New Roman"/>
+                <w:bCs/>
+              </w:rPr>
               <w:t>Malang, Indonesia</w:t>
             </w:r>
           </w:p>
@@ -1270,6 +1277,229 @@
           <w:iCs/>
         </w:rPr>
         <w:t>Technical Documentation: Create and maintain technical documentation, system workflows, and implementation references to support system development and future maintenance.</w:t>
+      </w:r>
+    </w:p>
+    <w:tbl>
+      <w:tblPr>
+        <w:tblStyle w:val="TableGrid"/>
+        <w:tblW w:w="0" w:type="auto"/>
+        <w:tblInd w:w="140" w:type="dxa"/>
+        <w:tblBorders>
+          <w:top w:val="none" w:sz="0" w:space="0" w:color="auto"/>
+          <w:left w:val="none" w:sz="0" w:space="0" w:color="auto"/>
+          <w:bottom w:val="none" w:sz="0" w:space="0" w:color="auto"/>
+          <w:right w:val="none" w:sz="0" w:space="0" w:color="auto"/>
+          <w:insideH w:val="none" w:sz="0" w:space="0" w:color="auto"/>
+          <w:insideV w:val="none" w:sz="0" w:space="0" w:color="auto"/>
+        </w:tblBorders>
+        <w:tblLook w:val="04A0" w:firstRow="1" w:lastRow="0" w:firstColumn="1" w:lastColumn="0" w:noHBand="0" w:noVBand="1"/>
+      </w:tblPr>
+      <w:tblGrid>
+        <w:gridCol w:w="6880"/>
+        <w:gridCol w:w="4014"/>
+      </w:tblGrid>
+      <w:tr>
+        <w:tc>
+          <w:tcPr>
+            <w:tcW w:w="6880" w:type="dxa"/>
+          </w:tcPr>
+          <w:p>
+            <w:pPr>
+              <w:tabs>
+                <w:tab w:val="left" w:pos="8505"/>
+              </w:tabs>
+              <w:spacing w:before="125" w:line="276" w:lineRule="auto"/>
+              <w:ind w:right="23"/>
+              <w:jc w:val="both"/>
+              <w:rPr>
+                <w:rFonts w:ascii="Times New Roman" w:hAnsi="Times New Roman" w:cs="Times New Roman"/>
+                <w:bCs/>
+              </w:rPr>
+            </w:pPr>
+            <w:proofErr w:type="spellStart"/>
+            <w:r>
+              <w:rPr>
+                <w:rFonts w:ascii="Times New Roman" w:hAnsi="Times New Roman" w:cs="Times New Roman"/>
+                <w:b/>
+              </w:rPr>
+              <w:t>Alignerr</w:t>
+            </w:r>
+            <w:proofErr w:type="spellEnd"/>
+            <w:r>
+              <w:rPr>
+                <w:rFonts w:ascii="Times New Roman" w:hAnsi="Times New Roman" w:cs="Times New Roman"/>
+                <w:b/>
+              </w:rPr>
+              <w:t xml:space="preserve"> (Pulsar World Alignment Project)</w:t>
+            </w:r>
+            <w:r>
+              <w:rPr>
+                <w:rFonts w:ascii="Times New Roman" w:hAnsi="Times New Roman" w:cs="Times New Roman"/>
+                <w:bCs/>
+              </w:rPr>
+              <w:t xml:space="preserve">, </w:t>
+            </w:r>
+            <w:r>
+              <w:rPr>
+                <w:rFonts w:ascii="Times New Roman" w:hAnsi="Times New Roman" w:cs="Times New Roman"/>
+                <w:bCs/>
+              </w:rPr>
+              <w:t>Remote, California, USA</w:t>
+            </w:r>
+          </w:p>
+        </w:tc>
+        <w:tc>
+          <w:tcPr>
+            <w:tcW w:w="4014" w:type="dxa"/>
+          </w:tcPr>
+          <w:p>
+            <w:pPr>
+              <w:tabs>
+                <w:tab w:val="left" w:pos="8505"/>
+              </w:tabs>
+              <w:spacing w:before="125" w:line="276" w:lineRule="auto"/>
+              <w:ind w:right="23"/>
+              <w:jc w:val="right"/>
+              <w:rPr>
+                <w:rFonts w:ascii="Times New Roman" w:hAnsi="Times New Roman" w:cs="Times New Roman"/>
+                <w:bCs/>
+              </w:rPr>
+            </w:pPr>
+            <w:r>
+              <w:rPr>
+                <w:rFonts w:ascii="Times New Roman" w:hAnsi="Times New Roman" w:cs="Times New Roman"/>
+                <w:bCs/>
+              </w:rPr>
+              <w:t xml:space="preserve"> </w:t>
+            </w:r>
+            <w:r>
+              <w:rPr>
+                <w:rFonts w:ascii="Times New Roman" w:hAnsi="Times New Roman" w:cs="Times New Roman"/>
+                <w:bCs/>
+              </w:rPr>
+              <w:t xml:space="preserve">Aug </w:t>
+            </w:r>
+            <w:r>
+              <w:rPr>
+                <w:rFonts w:ascii="Times New Roman" w:hAnsi="Times New Roman" w:cs="Times New Roman"/>
+                <w:bCs/>
+              </w:rPr>
+              <w:t>202</w:t>
+            </w:r>
+            <w:r>
+              <w:rPr>
+                <w:rFonts w:ascii="Times New Roman" w:hAnsi="Times New Roman" w:cs="Times New Roman"/>
+                <w:bCs/>
+              </w:rPr>
+              <w:t>6</w:t>
+            </w:r>
+            <w:r>
+              <w:rPr>
+                <w:rFonts w:ascii="Times New Roman" w:hAnsi="Times New Roman" w:cs="Times New Roman"/>
+                <w:bCs/>
+              </w:rPr>
+              <w:t xml:space="preserve"> </w:t>
+            </w:r>
+            <w:r>
+              <w:rPr>
+                <w:rFonts w:ascii="Times New Roman" w:hAnsi="Times New Roman" w:cs="Times New Roman"/>
+                <w:bCs/>
+              </w:rPr>
+              <w:t>- Present</w:t>
+            </w:r>
+          </w:p>
+        </w:tc>
+      </w:tr>
+    </w:tbl>
+    <w:p>
+      <w:pPr>
+        <w:spacing w:before="49" w:line="276" w:lineRule="auto"/>
+        <w:ind w:firstLine="360"/>
+        <w:jc w:val="both"/>
+        <w:rPr>
+          <w:rFonts w:ascii="Times New Roman" w:hAnsi="Times New Roman" w:cs="Times New Roman"/>
+          <w:i/>
+        </w:rPr>
+      </w:pPr>
+      <w:r>
+        <w:rPr>
+          <w:rFonts w:ascii="Times New Roman" w:hAnsi="Times New Roman" w:cs="Times New Roman"/>
+          <w:i/>
+        </w:rPr>
+        <w:t>Data Labeling Audio Specialist (Freelance)</w:t>
+      </w:r>
+    </w:p>
+    <w:p>
+      <w:pPr>
+        <w:pStyle w:val="ListParagraph"/>
+        <w:numPr>
+          <w:ilvl w:val="0"/>
+          <w:numId w:val="7"/>
+        </w:numPr>
+        <w:spacing w:before="49" w:line="276" w:lineRule="auto"/>
+        <w:jc w:val="both"/>
+        <w:rPr>
+          <w:rFonts w:ascii="Times New Roman" w:hAnsi="Times New Roman" w:cs="Times New Roman"/>
+          <w:iCs/>
+        </w:rPr>
+      </w:pPr>
+      <w:r>
+        <w:rPr>
+          <w:rFonts w:ascii="Times New Roman" w:hAnsi="Times New Roman" w:cs="Times New Roman"/>
+          <w:iCs/>
+        </w:rPr>
+        <w:t>Executed 52+ hours of high-precision audio evaluation, transcription verification, and acoustic-semantic alignment supporting frontier multimodal AI model training</w:t>
+      </w:r>
+      <w:r>
+        <w:rPr>
+          <w:rFonts w:ascii="Times New Roman" w:hAnsi="Times New Roman" w:cs="Times New Roman"/>
+          <w:iCs/>
+        </w:rPr>
+        <w:t>.</w:t>
+      </w:r>
+    </w:p>
+    <w:p>
+      <w:pPr>
+        <w:pStyle w:val="ListParagraph"/>
+        <w:numPr>
+          <w:ilvl w:val="0"/>
+          <w:numId w:val="7"/>
+        </w:numPr>
+        <w:spacing w:before="49" w:line="276" w:lineRule="auto"/>
+        <w:jc w:val="both"/>
+        <w:rPr>
+          <w:rFonts w:ascii="Times New Roman" w:hAnsi="Times New Roman" w:cs="Times New Roman"/>
+          <w:iCs/>
+        </w:rPr>
+      </w:pPr>
+      <w:r>
+        <w:rPr>
+          <w:rFonts w:ascii="Times New Roman" w:hAnsi="Times New Roman" w:cs="Times New Roman"/>
+          <w:iCs/>
+        </w:rPr>
+        <w:t>Completed complex, long-horizon audio annotation workflows averaging ~70 minutes per submission while maintaining a 0% task skip rate across strict technical rubrics.</w:t>
+      </w:r>
+    </w:p>
+    <w:p>
+      <w:pPr>
+        <w:pStyle w:val="ListParagraph"/>
+        <w:numPr>
+          <w:ilvl w:val="0"/>
+          <w:numId w:val="7"/>
+        </w:numPr>
+        <w:spacing w:before="49" w:line="276" w:lineRule="auto"/>
+        <w:jc w:val="both"/>
+        <w:rPr>
+          <w:rFonts w:ascii="Times New Roman" w:hAnsi="Times New Roman" w:cs="Times New Roman"/>
+          <w:iCs/>
+        </w:rPr>
+      </w:pPr>
+      <w:r>
+        <w:rPr>
+          <w:rFonts w:ascii="Times New Roman" w:hAnsi="Times New Roman" w:cs="Times New Roman"/>
+          <w:iCs/>
+        </w:rPr>
+        <w:t>Collaborated through 26+ structured multi-stage QA review cycles and iterative rubric calibrations to uphold acoustic fidelity and model alignment standards.</w:t>
       </w:r>
     </w:p>
     <w:tbl>
@@ -1330,7 +1560,21 @@
                 <w:rFonts w:ascii="Times New Roman" w:hAnsi="Times New Roman" w:cs="Times New Roman"/>
                 <w:bCs/>
               </w:rPr>
-              <w:t xml:space="preserve">, </w:t>
+              <w:t>,</w:t>
+            </w:r>
+            <w:r>
+              <w:rPr>
+                <w:rFonts w:ascii="Times New Roman" w:hAnsi="Times New Roman" w:cs="Times New Roman"/>
+                <w:bCs/>
+              </w:rPr>
+              <w:t xml:space="preserve"> On-Site,</w:t>
+            </w:r>
+            <w:r>
+              <w:rPr>
+                <w:rFonts w:ascii="Times New Roman" w:hAnsi="Times New Roman" w:cs="Times New Roman"/>
+                <w:bCs/>
+              </w:rPr>
+              <w:t xml:space="preserve"> </w:t>
             </w:r>
             <w:r>
               <w:rPr>
@@ -1508,6 +1752,7 @@
           <w:rFonts w:ascii="Times New Roman" w:hAnsi="Times New Roman" w:cs="Times New Roman"/>
           <w:iCs/>
         </w:rPr>
+        <w:lastRenderedPageBreak/>
         <w:t>Logic Verification &amp; Load Testing (Apps Script): Developed and executed stress tests on Google Apps Script for an automated PDF payroll system, implementing robust error handling (try-catch blocks) to guarantee script resilience against internet connection dropouts.</w:t>
       </w:r>
     </w:p>
@@ -1532,36 +1777,6 @@
         </w:rPr>
         <w:t>System Integration &amp; Data Pipeline Validation: Built and tested the reliability of real-time data pipelines integrating Google Forms, the main database, and an HTML/JavaScript (Fetch API) monitoring dashboard to successfully prevent any data collisions.</w:t>
       </w:r>
-    </w:p>
-    <w:p>
-      <w:pPr>
-        <w:spacing w:before="49" w:line="276" w:lineRule="auto"/>
-        <w:jc w:val="both"/>
-        <w:rPr>
-          <w:rFonts w:ascii="Times New Roman" w:hAnsi="Times New Roman" w:cs="Times New Roman"/>
-          <w:iCs/>
-        </w:rPr>
-      </w:pPr>
-    </w:p>
-    <w:p>
-      <w:pPr>
-        <w:spacing w:before="49" w:line="276" w:lineRule="auto"/>
-        <w:jc w:val="both"/>
-        <w:rPr>
-          <w:rFonts w:ascii="Times New Roman" w:hAnsi="Times New Roman" w:cs="Times New Roman"/>
-          <w:iCs/>
-        </w:rPr>
-      </w:pPr>
-    </w:p>
-    <w:p>
-      <w:pPr>
-        <w:spacing w:before="49" w:line="276" w:lineRule="auto"/>
-        <w:jc w:val="both"/>
-        <w:rPr>
-          <w:rFonts w:ascii="Times New Roman" w:hAnsi="Times New Roman" w:cs="Times New Roman"/>
-          <w:iCs/>
-        </w:rPr>
-      </w:pPr>
     </w:p>
     <w:tbl>
       <w:tblPr>
@@ -1579,13 +1794,13 @@
         <w:tblLook w:val="04A0" w:firstRow="1" w:lastRow="0" w:firstColumn="1" w:lastColumn="0" w:noHBand="0" w:noVBand="1"/>
       </w:tblPr>
       <w:tblGrid>
-        <w:gridCol w:w="5455"/>
-        <w:gridCol w:w="5449"/>
+        <w:gridCol w:w="6070"/>
+        <w:gridCol w:w="4834"/>
       </w:tblGrid>
       <w:tr>
         <w:tc>
           <w:tcPr>
-            <w:tcW w:w="5517" w:type="dxa"/>
+            <w:tcW w:w="6070" w:type="dxa"/>
           </w:tcPr>
           <w:p>
             <w:pPr>
@@ -1605,7 +1820,6 @@
                 <w:rFonts w:ascii="Times New Roman" w:hAnsi="Times New Roman" w:cs="Times New Roman"/>
                 <w:b/>
               </w:rPr>
-              <w:lastRenderedPageBreak/>
               <w:t xml:space="preserve">Dinas </w:t>
             </w:r>
             <w:proofErr w:type="spellStart"/>
@@ -1630,6 +1844,13 @@
                 <w:bCs/>
               </w:rPr>
               <w:t xml:space="preserve">, </w:t>
+            </w:r>
+            <w:r>
+              <w:rPr>
+                <w:rFonts w:ascii="Times New Roman" w:hAnsi="Times New Roman" w:cs="Times New Roman"/>
+                <w:bCs/>
+              </w:rPr>
+              <w:t xml:space="preserve">On-Site, </w:t>
             </w:r>
             <w:r>
               <w:rPr>
@@ -1649,7 +1870,7 @@
         </w:tc>
         <w:tc>
           <w:tcPr>
-            <w:tcW w:w="5517" w:type="dxa"/>
+            <w:tcW w:w="4834" w:type="dxa"/>
           </w:tcPr>
           <w:p>
             <w:pPr>
@@ -3171,6 +3392,7 @@
                 <w:sz w:val="20"/>
                 <w:szCs w:val="20"/>
               </w:rPr>
+              <w:lastRenderedPageBreak/>
               <w:t>Mini HR Data Pipeline &amp; Realtime Operations Dashboard</w:t>
             </w:r>
           </w:p>
@@ -3378,7 +3600,6 @@
           <w:sz w:val="20"/>
           <w:szCs w:val="20"/>
         </w:rPr>
-        <w:lastRenderedPageBreak/>
         <w:t>T</w:t>
       </w:r>
       <w:r>
@@ -7085,7 +7306,7 @@
   <w:style w:type="paragraph" w:default="1" w:styleId="Normal">
     <w:name w:val="Normal"/>
     <w:qFormat/>
-    <w:rsid w:val="00E16F19"/>
+    <w:rsid w:val="00EE6274"/>
     <w:rPr>
       <w:rFonts w:ascii="Arial MT" w:eastAsia="Arial MT" w:hAnsi="Arial MT" w:cs="Arial MT"/>
     </w:rPr>

</xml_diff>